<commit_message>
feat: update project documentation and add new recipe to db.json
</commit_message>
<xml_diff>
--- a/documents/writeup.docx
+++ b/documents/writeup.docx
@@ -32,7 +32,7 @@
         <w:pStyle w:val="FirstParagraph"/>
       </w:pPr>
       <w:r>
-        <w:t xml:space="preserve">The Recipe App is a single-page React application that lets users browse, search, add, edit, and delete personal recipes. It was built as part of a Full-Stack Web Development Bootcamp curriculum to practice integrating a React frontend with a lightweight REST-style backend (JSON Server).</w:t>
+        <w:t xml:space="preserve">The Recipe App is a single-page React application that lets users browse, search, add, edit, and delete personal recipes. It was generated and refined through GenAI-assisted development under direct management and quality oversight as part of a Full-Stack Web Development Bootcamp curriculum. The project demonstrates the ability to guide AI code generation, validate implementations against React best practices, and ensure production-ready functionality.</w:t>
       </w:r>
     </w:p>
     <w:p>
@@ -61,7 +61,7 @@
         </w:numPr>
       </w:pPr>
       <w:r>
-        <w:t xml:space="preserve">Apply React fundamentals — components, props, state, and hooks — in a real-world project</w:t>
+        <w:t xml:space="preserve">Manage GenAI code generation to build a complete React application with CRUD operations</w:t>
       </w:r>
     </w:p>
     <w:p>
@@ -73,7 +73,7 @@
         </w:numPr>
       </w:pPr>
       <w:r>
-        <w:t xml:space="preserve">Use client-side routing to simulate a multi-page experience</w:t>
+        <w:t xml:space="preserve">Guide AI implementation to follow React fundamentals — components, props, state, and hooks — in a production-ready way</w:t>
       </w:r>
     </w:p>
     <w:p>
@@ -85,7 +85,7 @@
         </w:numPr>
       </w:pPr>
       <w:r>
-        <w:t xml:space="preserve">Persist data to a local JSON database via API calls instead of browser storage</w:t>
+        <w:t xml:space="preserve">Validate client-side routing implementation to simulate a multi-page experience</w:t>
       </w:r>
     </w:p>
     <w:p>
@@ -97,7 +97,7 @@
         </w:numPr>
       </w:pPr>
       <w:r>
-        <w:t xml:space="preserve">Practice component reuse, custom hooks, and the Context API for shared application state</w:t>
+        <w:t xml:space="preserve">Ensure proper data persistence to a local JSON database via API calls</w:t>
       </w:r>
     </w:p>
     <w:p>
@@ -109,7 +109,31 @@
         </w:numPr>
       </w:pPr>
       <w:r>
-        <w:t xml:space="preserve">Build a responsive, clean UI using vanilla CSS variables and layout patterns</w:t>
+        <w:t xml:space="preserve">Review and refine component reuse patterns, custom hooks, and Context API state management</w:t>
+      </w:r>
+    </w:p>
+    <w:p>
+      <w:pPr>
+        <w:pStyle w:val="Compact"/>
+        <w:numPr>
+          <w:ilvl w:val="0"/>
+          <w:numId w:val="1001"/>
+        </w:numPr>
+      </w:pPr>
+      <w:r>
+        <w:t xml:space="preserve">Oversee responsive UI design using vanilla CSS variables and layout patterns</w:t>
+      </w:r>
+    </w:p>
+    <w:p>
+      <w:pPr>
+        <w:pStyle w:val="Compact"/>
+        <w:numPr>
+          <w:ilvl w:val="0"/>
+          <w:numId w:val="1001"/>
+        </w:numPr>
+      </w:pPr>
+      <w:r>
+        <w:t xml:space="preserve">Verify and test all functionality through understanding of the underlying implementation</w:t>
       </w:r>
     </w:p>
     <w:p>
@@ -148,15 +172,15 @@
         </w:rPr>
         <w:t xml:space="preserve">Data Layer</w:t>
       </w:r>
-      <w:r>
-        <w:t xml:space="preserve"> </w:t>
-      </w:r>
-      <w:r>
-        <w:t xml:space="preserve">-</w:t>
-      </w:r>
-      <w:r>
-        <w:t xml:space="preserve"> </w:t>
-      </w:r>
+    </w:p>
+    <w:p>
+      <w:pPr>
+        <w:pStyle w:val="Compact"/>
+        <w:numPr>
+          <w:ilvl w:val="0"/>
+          <w:numId w:val="1002"/>
+        </w:numPr>
+      </w:pPr>
       <w:r>
         <w:rPr>
           <w:rStyle w:val="VerbatimChar"/>
@@ -169,15 +193,15 @@
       <w:r>
         <w:t xml:space="preserve">serves as the database, managed at runtime by JSON Server on port 3002</w:t>
       </w:r>
-      <w:r>
-        <w:t xml:space="preserve"> </w:t>
-      </w:r>
-      <w:r>
-        <w:t xml:space="preserve">-</w:t>
-      </w:r>
-      <w:r>
-        <w:t xml:space="preserve"> </w:t>
-      </w:r>
+    </w:p>
+    <w:p>
+      <w:pPr>
+        <w:pStyle w:val="Compact"/>
+        <w:numPr>
+          <w:ilvl w:val="0"/>
+          <w:numId w:val="1002"/>
+        </w:numPr>
+      </w:pPr>
       <w:r>
         <w:rPr>
           <w:rStyle w:val="VerbatimChar"/>
@@ -205,15 +229,15 @@
       <w:r>
         <w:t xml:space="preserve">calls (GET, POST, PUT, DELETE) and centralises error messaging</w:t>
       </w:r>
-      <w:r>
-        <w:t xml:space="preserve"> </w:t>
-      </w:r>
-      <w:r>
-        <w:t xml:space="preserve">-</w:t>
-      </w:r>
-      <w:r>
-        <w:t xml:space="preserve"> </w:t>
-      </w:r>
+    </w:p>
+    <w:p>
+      <w:pPr>
+        <w:pStyle w:val="Compact"/>
+        <w:numPr>
+          <w:ilvl w:val="0"/>
+          <w:numId w:val="1002"/>
+        </w:numPr>
+      </w:pPr>
       <w:r>
         <w:rPr>
           <w:rStyle w:val="VerbatimChar"/>
@@ -253,7 +277,7 @@
     </w:p>
     <w:p>
       <w:pPr>
-        <w:pStyle w:val="BodyText"/>
+        <w:pStyle w:val="FirstParagraph"/>
       </w:pPr>
       <w:r>
         <w:rPr>
@@ -262,15 +286,15 @@
         </w:rPr>
         <w:t xml:space="preserve">Routing</w:t>
       </w:r>
-      <w:r>
-        <w:t xml:space="preserve"> </w:t>
-      </w:r>
-      <w:r>
-        <w:t xml:space="preserve">-</w:t>
-      </w:r>
-      <w:r>
-        <w:t xml:space="preserve"> </w:t>
-      </w:r>
+    </w:p>
+    <w:p>
+      <w:pPr>
+        <w:pStyle w:val="Compact"/>
+        <w:numPr>
+          <w:ilvl w:val="0"/>
+          <w:numId w:val="1003"/>
+        </w:numPr>
+      </w:pPr>
       <w:r>
         <w:rPr>
           <w:rStyle w:val="VerbatimChar"/>
@@ -292,11 +316,17 @@
         </w:rPr>
         <w:t xml:space="preserve">App.jsx</w:t>
       </w:r>
-      <w:r>
-        <w:t xml:space="preserve"> </w:t>
-      </w:r>
-      <w:r>
-        <w:t xml:space="preserve">- A shared</w:t>
+    </w:p>
+    <w:p>
+      <w:pPr>
+        <w:pStyle w:val="Compact"/>
+        <w:numPr>
+          <w:ilvl w:val="0"/>
+          <w:numId w:val="1003"/>
+        </w:numPr>
+      </w:pPr>
+      <w:r>
+        <w:t xml:space="preserve">A shared</w:t>
       </w:r>
       <w:r>
         <w:t xml:space="preserve"> </w:t>
@@ -328,11 +358,17 @@
       <w:r>
         <w:t xml:space="preserve">rendering the active page</w:t>
       </w:r>
-      <w:r>
-        <w:t xml:space="preserve"> </w:t>
-      </w:r>
-      <w:r>
-        <w:t xml:space="preserve">- Four routes are registered: Home (</w:t>
+    </w:p>
+    <w:p>
+      <w:pPr>
+        <w:pStyle w:val="Compact"/>
+        <w:numPr>
+          <w:ilvl w:val="0"/>
+          <w:numId w:val="1003"/>
+        </w:numPr>
+      </w:pPr>
+      <w:r>
+        <w:t xml:space="preserve">Four routes are registered: Home (</w:t>
       </w:r>
       <w:r>
         <w:rPr>
@@ -370,16 +406,22 @@
       <w:r>
         <w:t xml:space="preserve">)</w:t>
       </w:r>
-      <w:r>
-        <w:t xml:space="preserve"> </w:t>
-      </w:r>
-      <w:r>
-        <w:t xml:space="preserve">- Unknown paths redirect to Home</w:t>
-      </w:r>
-    </w:p>
-    <w:p>
-      <w:pPr>
-        <w:pStyle w:val="BodyText"/>
+    </w:p>
+    <w:p>
+      <w:pPr>
+        <w:pStyle w:val="Compact"/>
+        <w:numPr>
+          <w:ilvl w:val="0"/>
+          <w:numId w:val="1003"/>
+        </w:numPr>
+      </w:pPr>
+      <w:r>
+        <w:t xml:space="preserve">Unknown paths redirect to Home</w:t>
+      </w:r>
+    </w:p>
+    <w:p>
+      <w:pPr>
+        <w:pStyle w:val="FirstParagraph"/>
       </w:pPr>
       <w:r>
         <w:rPr>
@@ -800,7 +842,7 @@
         <w:pStyle w:val="Compact"/>
         <w:numPr>
           <w:ilvl w:val="0"/>
-          <w:numId w:val="1002"/>
+          <w:numId w:val="1004"/>
         </w:numPr>
       </w:pPr>
       <w:r>
@@ -822,7 +864,7 @@
         <w:pStyle w:val="Compact"/>
         <w:numPr>
           <w:ilvl w:val="0"/>
-          <w:numId w:val="1002"/>
+          <w:numId w:val="1004"/>
         </w:numPr>
       </w:pPr>
       <w:r>
@@ -844,7 +886,7 @@
         <w:pStyle w:val="Compact"/>
         <w:numPr>
           <w:ilvl w:val="0"/>
-          <w:numId w:val="1002"/>
+          <w:numId w:val="1004"/>
         </w:numPr>
       </w:pPr>
       <w:r>
@@ -866,7 +908,7 @@
         <w:pStyle w:val="Compact"/>
         <w:numPr>
           <w:ilvl w:val="0"/>
-          <w:numId w:val="1002"/>
+          <w:numId w:val="1004"/>
         </w:numPr>
       </w:pPr>
       <w:r>
@@ -888,7 +930,7 @@
         <w:pStyle w:val="Compact"/>
         <w:numPr>
           <w:ilvl w:val="0"/>
-          <w:numId w:val="1002"/>
+          <w:numId w:val="1004"/>
         </w:numPr>
       </w:pPr>
       <w:r>
@@ -910,7 +952,7 @@
         <w:pStyle w:val="Compact"/>
         <w:numPr>
           <w:ilvl w:val="0"/>
-          <w:numId w:val="1002"/>
+          <w:numId w:val="1004"/>
         </w:numPr>
       </w:pPr>
       <w:r>
@@ -932,7 +974,7 @@
         <w:pStyle w:val="Compact"/>
         <w:numPr>
           <w:ilvl w:val="0"/>
-          <w:numId w:val="1002"/>
+          <w:numId w:val="1004"/>
         </w:numPr>
       </w:pPr>
       <w:r>
@@ -954,7 +996,7 @@
         <w:pStyle w:val="Compact"/>
         <w:numPr>
           <w:ilvl w:val="0"/>
-          <w:numId w:val="1002"/>
+          <w:numId w:val="1004"/>
         </w:numPr>
       </w:pPr>
       <w:r>
@@ -976,7 +1018,7 @@
         <w:pStyle w:val="Compact"/>
         <w:numPr>
           <w:ilvl w:val="0"/>
-          <w:numId w:val="1002"/>
+          <w:numId w:val="1004"/>
         </w:numPr>
       </w:pPr>
       <w:r>
@@ -1291,7 +1333,7 @@
       <w:pPr>
         <w:numPr>
           <w:ilvl w:val="0"/>
-          <w:numId w:val="1003"/>
+          <w:numId w:val="1005"/>
         </w:numPr>
       </w:pPr>
       <w:r>
@@ -1302,7 +1344,7 @@
       <w:pPr>
         <w:numPr>
           <w:ilvl w:val="0"/>
-          <w:numId w:val="1003"/>
+          <w:numId w:val="1005"/>
         </w:numPr>
       </w:pPr>
       <w:r>
@@ -1328,7 +1370,7 @@
       <w:pPr>
         <w:numPr>
           <w:ilvl w:val="0"/>
-          <w:numId w:val="1003"/>
+          <w:numId w:val="1005"/>
         </w:numPr>
       </w:pPr>
       <w:r>
@@ -1354,7 +1396,7 @@
       <w:pPr>
         <w:numPr>
           <w:ilvl w:val="0"/>
-          <w:numId w:val="1003"/>
+          <w:numId w:val="1005"/>
         </w:numPr>
       </w:pPr>
       <w:r>
@@ -1380,7 +1422,7 @@
       <w:pPr>
         <w:numPr>
           <w:ilvl w:val="0"/>
-          <w:numId w:val="1003"/>
+          <w:numId w:val="1005"/>
         </w:numPr>
       </w:pPr>
       <w:r>
@@ -1418,11 +1460,21 @@
         <w:pStyle w:val="Compact"/>
         <w:numPr>
           <w:ilvl w:val="0"/>
-          <w:numId w:val="1004"/>
-        </w:numPr>
-      </w:pPr>
-      <w:r>
-        <w:t xml:space="preserve">React 19 with functional components, hooks, and Context API</w:t>
+          <w:numId w:val="1006"/>
+        </w:numPr>
+      </w:pPr>
+      <w:r>
+        <w:rPr>
+          <w:b/>
+          <w:bCs/>
+        </w:rPr>
+        <w:t xml:space="preserve">GenAI Code Generation Management</w:t>
+      </w:r>
+      <w:r>
+        <w:t xml:space="preserve"> </w:t>
+      </w:r>
+      <w:r>
+        <w:t xml:space="preserve">— Prompt engineering and iterative refinement of AI-generated React code to match project requirements</w:t>
       </w:r>
     </w:p>
     <w:p>
@@ -1430,11 +1482,21 @@
         <w:pStyle w:val="Compact"/>
         <w:numPr>
           <w:ilvl w:val="0"/>
-          <w:numId w:val="1004"/>
-        </w:numPr>
-      </w:pPr>
-      <w:r>
-        <w:t xml:space="preserve">Client-side routing with React Router v7</w:t>
+          <w:numId w:val="1006"/>
+        </w:numPr>
+      </w:pPr>
+      <w:r>
+        <w:rPr>
+          <w:b/>
+          <w:bCs/>
+        </w:rPr>
+        <w:t xml:space="preserve">Code Review &amp; Quality Assurance</w:t>
+      </w:r>
+      <w:r>
+        <w:t xml:space="preserve"> </w:t>
+      </w:r>
+      <w:r>
+        <w:t xml:space="preserve">— Validating AI implementations against React best practices, identifying and fixing linting errors, and verifying production readiness</w:t>
       </w:r>
     </w:p>
     <w:p>
@@ -1442,11 +1504,21 @@
         <w:pStyle w:val="Compact"/>
         <w:numPr>
           <w:ilvl w:val="0"/>
-          <w:numId w:val="1004"/>
-        </w:numPr>
-      </w:pPr>
-      <w:r>
-        <w:t xml:space="preserve">Async data fetching with the native Fetch API and proper loading/error state</w:t>
+          <w:numId w:val="1006"/>
+        </w:numPr>
+      </w:pPr>
+      <w:r>
+        <w:rPr>
+          <w:b/>
+          <w:bCs/>
+        </w:rPr>
+        <w:t xml:space="preserve">React Architecture Understanding</w:t>
+      </w:r>
+      <w:r>
+        <w:t xml:space="preserve"> </w:t>
+      </w:r>
+      <w:r>
+        <w:t xml:space="preserve">— Deep knowledge of functional components, hooks (useState, useCallback, useMemo, useContext), and Context API required to oversee and refine AI-generated implementations</w:t>
       </w:r>
     </w:p>
     <w:p>
@@ -1454,11 +1526,21 @@
         <w:pStyle w:val="Compact"/>
         <w:numPr>
           <w:ilvl w:val="0"/>
-          <w:numId w:val="1004"/>
-        </w:numPr>
-      </w:pPr>
-      <w:r>
-        <w:t xml:space="preserve">CRUD operations (Create, Read, Update, Delete) against a REST-style API</w:t>
+          <w:numId w:val="1006"/>
+        </w:numPr>
+      </w:pPr>
+      <w:r>
+        <w:rPr>
+          <w:b/>
+          <w:bCs/>
+        </w:rPr>
+        <w:t xml:space="preserve">Async Pattern Oversight</w:t>
+      </w:r>
+      <w:r>
+        <w:t xml:space="preserve"> </w:t>
+      </w:r>
+      <w:r>
+        <w:t xml:space="preserve">— Ensuring proper data fetching, loading/error state handling, and API call patterns in AI-generated code</w:t>
       </w:r>
     </w:p>
     <w:p>
@@ -1466,11 +1548,21 @@
         <w:pStyle w:val="Compact"/>
         <w:numPr>
           <w:ilvl w:val="0"/>
-          <w:numId w:val="1004"/>
-        </w:numPr>
-      </w:pPr>
-      <w:r>
-        <w:t xml:space="preserve">Controlled forms, client-side validation, and reusable form components</w:t>
+          <w:numId w:val="1006"/>
+        </w:numPr>
+      </w:pPr>
+      <w:r>
+        <w:rPr>
+          <w:b/>
+          <w:bCs/>
+        </w:rPr>
+        <w:t xml:space="preserve">Component Design Guidance</w:t>
+      </w:r>
+      <w:r>
+        <w:t xml:space="preserve"> </w:t>
+      </w:r>
+      <w:r>
+        <w:t xml:space="preserve">— Validating component reuse, controlled form patterns, and separation of concerns in the generated code</w:t>
       </w:r>
     </w:p>
     <w:p>
@@ -1478,11 +1570,21 @@
         <w:pStyle w:val="Compact"/>
         <w:numPr>
           <w:ilvl w:val="0"/>
-          <w:numId w:val="1004"/>
-        </w:numPr>
-      </w:pPr>
-      <w:r>
-        <w:t xml:space="preserve">Custom hooks for shared state management</w:t>
+          <w:numId w:val="1006"/>
+        </w:numPr>
+      </w:pPr>
+      <w:r>
+        <w:rPr>
+          <w:b/>
+          <w:bCs/>
+        </w:rPr>
+        <w:t xml:space="preserve">Routing Implementation Review</w:t>
+      </w:r>
+      <w:r>
+        <w:t xml:space="preserve"> </w:t>
+      </w:r>
+      <w:r>
+        <w:t xml:space="preserve">— Ensuring nested route structures, navigation patterns, and route-level state management follow React Router best practices</w:t>
       </w:r>
     </w:p>
     <w:p>
@@ -1490,11 +1592,21 @@
         <w:pStyle w:val="Compact"/>
         <w:numPr>
           <w:ilvl w:val="0"/>
-          <w:numId w:val="1004"/>
-        </w:numPr>
-      </w:pPr>
-      <w:r>
-        <w:t xml:space="preserve">Responsive layout with CSS Grid and CSS custom properties</w:t>
+          <w:numId w:val="1006"/>
+        </w:numPr>
+      </w:pPr>
+      <w:r>
+        <w:rPr>
+          <w:b/>
+          <w:bCs/>
+        </w:rPr>
+        <w:t xml:space="preserve">State Management Validation</w:t>
+      </w:r>
+      <w:r>
+        <w:t xml:space="preserve"> </w:t>
+      </w:r>
+      <w:r>
+        <w:t xml:space="preserve">— Reviewing custom hooks and Context patterns to ensure they’re performant and maintainable</w:t>
       </w:r>
     </w:p>
     <w:p>
@@ -1502,11 +1614,43 @@
         <w:pStyle w:val="Compact"/>
         <w:numPr>
           <w:ilvl w:val="0"/>
-          <w:numId w:val="1004"/>
-        </w:numPr>
-      </w:pPr>
-      <w:r>
-        <w:t xml:space="preserve">Project organisation into service, hook, component, and page layers</w:t>
+          <w:numId w:val="1006"/>
+        </w:numPr>
+      </w:pPr>
+      <w:r>
+        <w:rPr>
+          <w:b/>
+          <w:bCs/>
+        </w:rPr>
+        <w:t xml:space="preserve">Full-Stack Integration</w:t>
+      </w:r>
+      <w:r>
+        <w:t xml:space="preserve"> </w:t>
+      </w:r>
+      <w:r>
+        <w:t xml:space="preserve">— Understanding both the React frontend and JSON Server backend integration to guide coherent GenAI implementations</w:t>
+      </w:r>
+    </w:p>
+    <w:p>
+      <w:pPr>
+        <w:pStyle w:val="Compact"/>
+        <w:numPr>
+          <w:ilvl w:val="0"/>
+          <w:numId w:val="1006"/>
+        </w:numPr>
+      </w:pPr>
+      <w:r>
+        <w:rPr>
+          <w:b/>
+          <w:bCs/>
+        </w:rPr>
+        <w:t xml:space="preserve">Testing &amp; Iteration</w:t>
+      </w:r>
+      <w:r>
+        <w:t xml:space="preserve"> </w:t>
+      </w:r>
+      <w:r>
+        <w:t xml:space="preserve">— Deploying and testing AI-generated code to verify CRUD operations work end-to-end</w:t>
       </w:r>
     </w:p>
     <w:p>
@@ -1844,6 +1988,12 @@
     <w:abstractNumId w:val="991"/>
   </w:num>
   <w:num w:numId="1003">
+    <w:abstractNumId w:val="991"/>
+  </w:num>
+  <w:num w:numId="1004">
+    <w:abstractNumId w:val="991"/>
+  </w:num>
+  <w:num w:numId="1005">
     <w:abstractNumId w:val="99411"/>
     <w:lvlOverride w:ilvl="0">
       <w:startOverride w:val="1"/>
@@ -1873,7 +2023,7 @@
       <w:startOverride w:val="1"/>
     </w:lvlOverride>
   </w:num>
-  <w:num w:numId="1004">
+  <w:num w:numId="1006">
     <w:abstractNumId w:val="991"/>
   </w:num>
 </w:numbering>

</xml_diff>